<commit_message>
Fill the real company details into both legal documents and the site
UNP, registered address with its postcode, bank account and BIC, the director
who signs, and the office phones come from the company's own bank-details file.
The seller block in data.js now carries them, so the footer and the contacts
block show the UNP and cannot drift from the offer's requisites table.

The director is named as the person responsible for internal control of
personal data processing.

Co-Authored-By: Claude Opus 5 <noreply@anthropic.com>
</commit_message>
<xml_diff>
--- a/Политика_персональных_данных_forus_by.docx
+++ b/Политика_персональных_данных_forus_by.docx
@@ -25,7 +25,7 @@
     </w:p>
     <w:p>
       <w:r>
-        <w:t xml:space="preserve">1.2. Оператор: Частное производственное унитарное предприятие «ФОРУСультра», место нахождения — г. Витебск, ул. Володарского, 100, УНП ____________.</w:t>
+        <w:t xml:space="preserve">1.2. Оператор: Частное производственное унитарное предприятие «ФОРУСультра», УНП 390476970, место нахождения — 210016, г. Витебск, ул. Володарского, 100.</w:t>
       </w:r>
     </w:p>
     <w:p>
@@ -1226,7 +1226,7 @@
     </w:p>
     <w:p>
       <w:r>
-        <w:t xml:space="preserve">9.5. Заявление направляется по адресу: г. Витебск, ул. Володарского, 100, либо по адресу электронной почты info@forus.by.</w:t>
+        <w:t xml:space="preserve">9.5. Заявление направляется по адресу: 210016, г. Витебск, ул. Володарского, 100, либо по адресу электронной почты info@forus.by.</w:t>
       </w:r>
     </w:p>
     <w:p>
@@ -1244,7 +1244,7 @@
     </w:p>
     <w:p>
       <w:r>
-        <w:t xml:space="preserve">10.1. Оператор назначает лицо, ответственное за осуществление внутреннего контроля за обработкой персональных данных.</w:t>
+        <w:t xml:space="preserve">10.1. Лицом, ответственным за осуществление внутреннего контроля за обработкой персональных данных, является директор Оператора Бойко Светлана Владимировна.</w:t>
       </w:r>
     </w:p>
     <w:p>
@@ -1405,7 +1405,7 @@
               <w:spacing w:before="40" w:after="40"/>
             </w:pPr>
             <w:r>
-              <w:t xml:space="preserve">ЧПУП «ФОРУСультра»</w:t>
+              <w:t xml:space="preserve">ЧПУП «ФОРУСультра», УНП 390476970</w:t>
             </w:r>
           </w:p>
         </w:tc>
@@ -1433,7 +1433,7 @@
               <w:spacing w:before="40" w:after="40"/>
             </w:pPr>
             <w:r>
-              <w:t xml:space="preserve">г. Витебск, ул. Володарского, 100</w:t>
+              <w:t xml:space="preserve">210016, г. Витебск, ул. Володарского, 100</w:t>
             </w:r>
           </w:p>
         </w:tc>
@@ -1448,7 +1448,7 @@
               <w:spacing w:before="40" w:after="40"/>
             </w:pPr>
             <w:r>
-              <w:t xml:space="preserve">Телефон</w:t>
+              <w:t xml:space="preserve">Телефон, факс</w:t>
             </w:r>
           </w:p>
         </w:tc>
@@ -1461,7 +1461,7 @@
               <w:spacing w:before="40" w:after="40"/>
             </w:pPr>
             <w:r>
-              <w:t xml:space="preserve">+375 (29) 7-143-143</w:t>
+              <w:t xml:space="preserve">8 (0212) 43-57-75, 43-57-74</w:t>
             </w:r>
           </w:p>
         </w:tc>
@@ -1476,6 +1476,34 @@
               <w:spacing w:before="40" w:after="40"/>
             </w:pPr>
             <w:r>
+              <w:t xml:space="preserve">Мобильный</w:t>
+            </w:r>
+          </w:p>
+        </w:tc>
+        <w:tc>
+          <w:tcPr>
+            <w:tcW w:w="6233" w:type="dxa"/>
+          </w:tcPr>
+          <w:p>
+            <w:pPr>
+              <w:spacing w:before="40" w:after="40"/>
+            </w:pPr>
+            <w:r>
+              <w:t xml:space="preserve">+375 (29) 7-143-143, +375 (44) 7-143-143</w:t>
+            </w:r>
+          </w:p>
+        </w:tc>
+      </w:tr>
+      <w:tr>
+        <w:tc>
+          <w:tcPr>
+            <w:tcW w:w="3117" w:type="dxa"/>
+          </w:tcPr>
+          <w:p>
+            <w:pPr>
+              <w:spacing w:before="40" w:after="40"/>
+            </w:pPr>
+            <w:r>
               <w:t xml:space="preserve">Электронная почта</w:t>
             </w:r>
           </w:p>
@@ -1517,7 +1545,7 @@
               <w:spacing w:before="40" w:after="40"/>
             </w:pPr>
             <w:r>
-              <w:t xml:space="preserve">____________ (должность, фамилия и инициалы)</w:t>
+              <w:t xml:space="preserve">директор Бойко С. В.</w:t>
             </w:r>
           </w:p>
         </w:tc>

</xml_diff>

<commit_message>
Name the legal counsel as responsible for personal data internal control
Splitting the roles: the director signs the appointment, the counsel performs
the control and reports on it.

Co-Authored-By: Claude Opus 5 <noreply@anthropic.com>
</commit_message>
<xml_diff>
--- a/Политика_персональных_данных_forus_by.docx
+++ b/Политика_персональных_данных_forus_by.docx
@@ -1244,7 +1244,7 @@
     </w:p>
     <w:p>
       <w:r>
-        <w:t xml:space="preserve">10.1. Лицом, ответственным за осуществление внутреннего контроля за обработкой персональных данных, является директор Оператора Бойко Светлана Владимировна.</w:t>
+        <w:t xml:space="preserve">10.1. Лицом, ответственным за осуществление внутреннего контроля за обработкой персональных данных, является юрисконсульт Оператора Закревский А. А., назначенный приказом директора.</w:t>
       </w:r>
     </w:p>
     <w:p>
@@ -1545,7 +1545,7 @@
               <w:spacing w:before="40" w:after="40"/>
             </w:pPr>
             <w:r>
-              <w:t xml:space="preserve">директор Бойко С. В.</w:t>
+              <w:t xml:space="preserve">юрисконсульт Закревский А. А.</w:t>
             </w:r>
           </w:p>
         </w:tc>

</xml_diff>